<commit_message>
Recorded temperature data for Task 1
</commit_message>
<xml_diff>
--- a/Sige_Wu_20719618.docx
+++ b/Sige_Wu_20719618.docx
@@ -18,33 +18,31 @@
     <w:p>
       <w:pPr>
         <w:rPr>
+          <w:b/>
+          <w:bCs/>
+          <w:lang w:eastAsia="zh-CN"/>
+        </w:rPr>
+      </w:pPr>
+      <w:r>
+        <w:rPr>
+          <w:b/>
+          <w:bCs/>
+        </w:rPr>
+        <w:t xml:space="preserve">Author: </w:t>
+      </w:r>
+      <w:r>
+        <w:rPr>
           <w:rFonts w:hint="eastAsia"/>
           <w:b/>
           <w:bCs/>
           <w:lang w:eastAsia="zh-CN"/>
         </w:rPr>
-      </w:pPr>
-      <w:r>
-        <w:rPr>
-          <w:b/>
-          <w:bCs/>
-        </w:rPr>
-        <w:t xml:space="preserve">Author: </w:t>
-      </w:r>
-      <w:r>
-        <w:rPr>
-          <w:rFonts w:hint="eastAsia"/>
-          <w:b/>
-          <w:bCs/>
-          <w:lang w:eastAsia="zh-CN"/>
-        </w:rPr>
         <w:t>Sige Wu</w:t>
       </w:r>
     </w:p>
     <w:p>
       <w:pPr>
         <w:rPr>
-          <w:rFonts w:hint="eastAsia"/>
           <w:b/>
           <w:bCs/>
           <w:lang w:eastAsia="zh-CN"/>
@@ -108,35 +106,245 @@
     </w:p>
     <w:p>
       <w:pPr>
-        <w:rPr>
-          <w:color w:val="808080" w:themeColor="background1" w:themeShade="80"/>
-        </w:rPr>
-      </w:pPr>
-      <w:r>
-        <w:rPr>
-          <w:color w:val="808080" w:themeColor="background1" w:themeShade="80"/>
+        <w:pStyle w:val="Title"/>
+        <w:rPr>
+          <w:lang w:eastAsia="zh-CN"/>
+        </w:rPr>
+      </w:pPr>
+      <w:r>
+        <w:rPr>
+          <w:rFonts w:hint="eastAsia"/>
+          <w:lang w:eastAsia="zh-CN"/>
         </w:rPr>
         <w:lastRenderedPageBreak/>
-        <w:t>For questions which require you to write text (i.e., descriptive sentences), or include images and graphs, please add them to the Word submission template.</w:t>
+        <w:t>Task 1</w:t>
       </w:r>
     </w:p>
     <w:p>
       <w:pPr>
-        <w:spacing w:line="259" w:lineRule="auto"/>
-        <w:jc w:val="both"/>
-        <w:rPr>
-          <w:color w:val="000000" w:themeColor="text1"/>
+        <w:rPr>
+          <w:rFonts w:hint="eastAsia"/>
+          <w:lang w:eastAsia="zh-CN"/>
+        </w:rPr>
+      </w:pPr>
+      <w:r>
+        <w:rPr>
+          <w:rFonts w:hint="eastAsia"/>
+          <w:lang w:eastAsia="zh-CN"/>
+        </w:rPr>
+        <w:t>P</w:t>
+      </w:r>
+      <w:r>
+        <w:rPr>
+          <w:lang w:eastAsia="zh-CN"/>
+        </w:rPr>
+        <w:t>hotograph of the implementation</w:t>
+      </w:r>
+      <w:r>
+        <w:rPr>
+          <w:rFonts w:hint="eastAsia"/>
+          <w:lang w:eastAsia="zh-CN"/>
+        </w:rPr>
+        <w:t>:</w:t>
+      </w:r>
+    </w:p>
+    <w:p>
+      <w:pPr>
+        <w:rPr>
           <w:highlight w:val="cyan"/>
-        </w:rPr>
-      </w:pPr>
+          <w:lang w:eastAsia="zh-CN"/>
+        </w:rPr>
+      </w:pPr>
+      <w:r>
+        <w:rPr>
+          <w:noProof/>
+          <w:highlight w:val="cyan"/>
+          <w:lang w:eastAsia="zh-CN"/>
+        </w:rPr>
+        <w:drawing>
+          <wp:inline distT="0" distB="0" distL="0" distR="0" wp14:anchorId="5FD82F49" wp14:editId="34F895DC">
+            <wp:extent cx="5689600" cy="3811129"/>
+            <wp:effectExtent l="0" t="0" r="6350" b="0"/>
+            <wp:docPr id="1395626455" name="Picture 3"/>
+            <wp:cNvGraphicFramePr>
+              <a:graphicFrameLocks xmlns:a="http://schemas.openxmlformats.org/drawingml/2006/main" noChangeAspect="1"/>
+            </wp:cNvGraphicFramePr>
+            <a:graphic xmlns:a="http://schemas.openxmlformats.org/drawingml/2006/main">
+              <a:graphicData uri="http://schemas.openxmlformats.org/drawingml/2006/picture">
+                <pic:pic xmlns:pic="http://schemas.openxmlformats.org/drawingml/2006/picture">
+                  <pic:nvPicPr>
+                    <pic:cNvPr id="0" name="Picture 1"/>
+                    <pic:cNvPicPr>
+                      <a:picLocks noChangeAspect="1" noChangeArrowheads="1"/>
+                    </pic:cNvPicPr>
+                  </pic:nvPicPr>
+                  <pic:blipFill rotWithShape="1">
+                    <a:blip r:embed="rId8" cstate="print">
+                      <a:extLst>
+                        <a:ext uri="{28A0092B-C50C-407E-A947-70E740481C1C}">
+                          <a14:useLocalDpi xmlns:a14="http://schemas.microsoft.com/office/drawing/2010/main" val="0"/>
+                        </a:ext>
+                      </a:extLst>
+                    </a:blip>
+                    <a:srcRect l="13651" t="25591" r="16426" b="11982"/>
+                    <a:stretch>
+                      <a:fillRect/>
+                    </a:stretch>
+                  </pic:blipFill>
+                  <pic:spPr bwMode="auto">
+                    <a:xfrm>
+                      <a:off x="0" y="0"/>
+                      <a:ext cx="5697158" cy="3816192"/>
+                    </a:xfrm>
+                    <a:prstGeom prst="rect">
+                      <a:avLst/>
+                    </a:prstGeom>
+                    <a:noFill/>
+                    <a:ln>
+                      <a:noFill/>
+                    </a:ln>
+                    <a:extLst>
+                      <a:ext uri="{53640926-AAD7-44D8-BBD7-CCE9431645EC}">
+                        <a14:shadowObscured xmlns:a14="http://schemas.microsoft.com/office/drawing/2010/main"/>
+                      </a:ext>
+                    </a:extLst>
+                  </pic:spPr>
+                </pic:pic>
+              </a:graphicData>
+            </a:graphic>
+          </wp:inline>
+        </w:drawing>
+      </w:r>
+    </w:p>
+    <w:p>
+      <w:pPr>
+        <w:rPr>
+          <w:rFonts w:hint="eastAsia"/>
+          <w:highlight w:val="cyan"/>
+          <w:lang w:eastAsia="zh-CN"/>
+        </w:rPr>
+      </w:pPr>
+      <w:r>
+        <w:rPr>
+          <w:rFonts w:hint="eastAsia"/>
+          <w:lang w:eastAsia="zh-CN"/>
+        </w:rPr>
+        <w:t>T</w:t>
+      </w:r>
+      <w:r>
+        <w:rPr>
+          <w:lang w:eastAsia="zh-CN"/>
+        </w:rPr>
+        <w:t>emperature</w:t>
+      </w:r>
+      <w:r>
+        <w:rPr>
+          <w:rFonts w:hint="eastAsia"/>
+          <w:lang w:eastAsia="zh-CN"/>
+        </w:rPr>
+        <w:t xml:space="preserve"> </w:t>
+      </w:r>
+      <w:r>
+        <w:rPr>
+          <w:lang w:eastAsia="zh-CN"/>
+        </w:rPr>
+        <w:t>vs</w:t>
+      </w:r>
+      <w:r>
+        <w:rPr>
+          <w:rFonts w:hint="eastAsia"/>
+          <w:lang w:eastAsia="zh-CN"/>
+        </w:rPr>
+        <w:t xml:space="preserve"> T</w:t>
+      </w:r>
+      <w:r>
+        <w:rPr>
+          <w:lang w:eastAsia="zh-CN"/>
+        </w:rPr>
+        <w:t>ime</w:t>
+      </w:r>
+      <w:r>
+        <w:rPr>
+          <w:rFonts w:hint="eastAsia"/>
+          <w:lang w:eastAsia="zh-CN"/>
+        </w:rPr>
+        <w:t xml:space="preserve"> </w:t>
+      </w:r>
+      <w:r>
+        <w:rPr>
+          <w:lang w:eastAsia="zh-CN"/>
+        </w:rPr>
+        <w:t>plot</w:t>
+      </w:r>
+      <w:r>
+        <w:rPr>
+          <w:rFonts w:hint="eastAsia"/>
+          <w:lang w:eastAsia="zh-CN"/>
+        </w:rPr>
+        <w:t>:</w:t>
+      </w:r>
+      <w:r>
+        <w:rPr>
+          <w:noProof/>
+          <w:lang w:eastAsia="zh-CN"/>
+        </w:rPr>
+        <w:drawing>
+          <wp:inline distT="0" distB="0" distL="0" distR="0" wp14:anchorId="4D0098F4" wp14:editId="70096F1D">
+            <wp:extent cx="5727700" cy="3454400"/>
+            <wp:effectExtent l="0" t="0" r="6350" b="0"/>
+            <wp:docPr id="2005729460" name="Picture 4"/>
+            <wp:cNvGraphicFramePr>
+              <a:graphicFrameLocks xmlns:a="http://schemas.openxmlformats.org/drawingml/2006/main" noChangeAspect="1"/>
+            </wp:cNvGraphicFramePr>
+            <a:graphic xmlns:a="http://schemas.openxmlformats.org/drawingml/2006/main">
+              <a:graphicData uri="http://schemas.openxmlformats.org/drawingml/2006/picture">
+                <pic:pic xmlns:pic="http://schemas.openxmlformats.org/drawingml/2006/picture">
+                  <pic:nvPicPr>
+                    <pic:cNvPr id="0" name="Picture 2"/>
+                    <pic:cNvPicPr>
+                      <a:picLocks noChangeAspect="1" noChangeArrowheads="1"/>
+                    </pic:cNvPicPr>
+                  </pic:nvPicPr>
+                  <pic:blipFill>
+                    <a:blip r:embed="rId9" cstate="print">
+                      <a:extLst>
+                        <a:ext uri="{28A0092B-C50C-407E-A947-70E740481C1C}">
+                          <a14:useLocalDpi xmlns:a14="http://schemas.microsoft.com/office/drawing/2010/main" val="0"/>
+                        </a:ext>
+                      </a:extLst>
+                    </a:blip>
+                    <a:srcRect/>
+                    <a:stretch>
+                      <a:fillRect/>
+                    </a:stretch>
+                  </pic:blipFill>
+                  <pic:spPr bwMode="auto">
+                    <a:xfrm>
+                      <a:off x="0" y="0"/>
+                      <a:ext cx="5727700" cy="3454400"/>
+                    </a:xfrm>
+                    <a:prstGeom prst="rect">
+                      <a:avLst/>
+                    </a:prstGeom>
+                    <a:noFill/>
+                    <a:ln>
+                      <a:noFill/>
+                    </a:ln>
+                  </pic:spPr>
+                </pic:pic>
+              </a:graphicData>
+            </a:graphic>
+          </wp:inline>
+        </w:drawing>
+      </w:r>
     </w:p>
     <w:sectPr>
-      <w:headerReference w:type="even" r:id="rId8"/>
-      <w:headerReference w:type="default" r:id="rId9"/>
-      <w:footerReference w:type="even" r:id="rId10"/>
-      <w:footerReference w:type="default" r:id="rId11"/>
-      <w:headerReference w:type="first" r:id="rId12"/>
-      <w:footerReference w:type="first" r:id="rId13"/>
+      <w:headerReference w:type="even" r:id="rId10"/>
+      <w:headerReference w:type="default" r:id="rId11"/>
+      <w:footerReference w:type="even" r:id="rId12"/>
+      <w:footerReference w:type="default" r:id="rId13"/>
+      <w:headerReference w:type="first" r:id="rId14"/>
+      <w:footerReference w:type="first" r:id="rId15"/>
       <w:pgSz w:w="11906" w:h="16838"/>
       <w:pgMar w:top="1440" w:right="1440" w:bottom="1440" w:left="1440" w:header="850" w:footer="708" w:gutter="0"/>
       <w:cols w:space="708"/>
@@ -295,7 +503,6 @@
     <w:pPr>
       <w:pStyle w:val="Footer"/>
       <w:rPr>
-        <w:rFonts w:hint="eastAsia"/>
         <w:sz w:val="18"/>
         <w:szCs w:val="18"/>
         <w:lang w:eastAsia="zh-CN"/>
@@ -1464,7 +1671,6 @@
   <w:style w:type="character" w:default="1" w:styleId="DefaultParagraphFont">
     <w:name w:val="Default Paragraph Font"/>
     <w:uiPriority w:val="1"/>
-    <w:semiHidden/>
     <w:unhideWhenUsed/>
   </w:style>
   <w:style w:type="table" w:default="1" w:styleId="TableNormal">

</xml_diff>

<commit_message>
Create function temp_monitor.m for Task 2.
</commit_message>
<xml_diff>
--- a/Sige_Wu_20719618.docx
+++ b/Sige_Wu_20719618.docx
@@ -123,7 +123,6 @@
     <w:p>
       <w:pPr>
         <w:rPr>
-          <w:rFonts w:hint="eastAsia"/>
           <w:lang w:eastAsia="zh-CN"/>
         </w:rPr>
       </w:pPr>
@@ -219,68 +218,66 @@
     <w:p>
       <w:pPr>
         <w:rPr>
+          <w:lang w:eastAsia="zh-CN"/>
+        </w:rPr>
+      </w:pPr>
+      <w:r>
+        <w:rPr>
           <w:rFonts w:hint="eastAsia"/>
-          <w:highlight w:val="cyan"/>
-          <w:lang w:eastAsia="zh-CN"/>
-        </w:rPr>
-      </w:pPr>
+          <w:lang w:eastAsia="zh-CN"/>
+        </w:rPr>
+        <w:t>T</w:t>
+      </w:r>
+      <w:r>
+        <w:rPr>
+          <w:lang w:eastAsia="zh-CN"/>
+        </w:rPr>
+        <w:t>emperature</w:t>
+      </w:r>
       <w:r>
         <w:rPr>
           <w:rFonts w:hint="eastAsia"/>
           <w:lang w:eastAsia="zh-CN"/>
         </w:rPr>
-        <w:t>T</w:t>
-      </w:r>
-      <w:r>
-        <w:rPr>
-          <w:lang w:eastAsia="zh-CN"/>
-        </w:rPr>
-        <w:t>emperature</w:t>
+        <w:t xml:space="preserve"> </w:t>
+      </w:r>
+      <w:r>
+        <w:rPr>
+          <w:lang w:eastAsia="zh-CN"/>
+        </w:rPr>
+        <w:t>vs</w:t>
       </w:r>
       <w:r>
         <w:rPr>
           <w:rFonts w:hint="eastAsia"/>
           <w:lang w:eastAsia="zh-CN"/>
         </w:rPr>
+        <w:t xml:space="preserve"> T</w:t>
+      </w:r>
+      <w:r>
+        <w:rPr>
+          <w:lang w:eastAsia="zh-CN"/>
+        </w:rPr>
+        <w:t>ime</w:t>
+      </w:r>
+      <w:r>
+        <w:rPr>
+          <w:rFonts w:hint="eastAsia"/>
+          <w:lang w:eastAsia="zh-CN"/>
+        </w:rPr>
         <w:t xml:space="preserve"> </w:t>
       </w:r>
       <w:r>
         <w:rPr>
           <w:lang w:eastAsia="zh-CN"/>
         </w:rPr>
-        <w:t>vs</w:t>
+        <w:t>plot</w:t>
       </w:r>
       <w:r>
         <w:rPr>
           <w:rFonts w:hint="eastAsia"/>
           <w:lang w:eastAsia="zh-CN"/>
         </w:rPr>
-        <w:t xml:space="preserve"> T</w:t>
-      </w:r>
-      <w:r>
-        <w:rPr>
-          <w:lang w:eastAsia="zh-CN"/>
-        </w:rPr>
-        <w:t>ime</w:t>
-      </w:r>
-      <w:r>
-        <w:rPr>
-          <w:rFonts w:hint="eastAsia"/>
-          <w:lang w:eastAsia="zh-CN"/>
-        </w:rPr>
-        <w:t xml:space="preserve"> </w:t>
-      </w:r>
-      <w:r>
-        <w:rPr>
-          <w:lang w:eastAsia="zh-CN"/>
-        </w:rPr>
-        <w:t>plot</w:t>
-      </w:r>
-      <w:r>
-        <w:rPr>
-          <w:rFonts w:hint="eastAsia"/>
-          <w:lang w:eastAsia="zh-CN"/>
-        </w:rPr>
         <w:t>:</w:t>
       </w:r>
       <w:r>
@@ -289,7 +286,7 @@
           <w:lang w:eastAsia="zh-CN"/>
         </w:rPr>
         <w:drawing>
-          <wp:inline distT="0" distB="0" distL="0" distR="0" wp14:anchorId="4D0098F4" wp14:editId="70096F1D">
+          <wp:inline distT="0" distB="0" distL="0" distR="0" wp14:anchorId="4D0098F4" wp14:editId="30A7022B">
             <wp:extent cx="5727700" cy="3454400"/>
             <wp:effectExtent l="0" t="0" r="6350" b="0"/>
             <wp:docPr id="2005729460" name="Picture 4"/>
@@ -338,13 +335,245 @@
         </w:drawing>
       </w:r>
     </w:p>
+    <w:p>
+      <w:pPr>
+        <w:spacing w:line="259" w:lineRule="auto"/>
+        <w:rPr>
+          <w:lang w:eastAsia="zh-CN"/>
+        </w:rPr>
+      </w:pPr>
+      <w:r>
+        <w:rPr>
+          <w:lang w:eastAsia="zh-CN"/>
+        </w:rPr>
+        <w:br w:type="page"/>
+      </w:r>
+    </w:p>
+    <w:p>
+      <w:pPr>
+        <w:pStyle w:val="Title"/>
+        <w:rPr>
+          <w:lang w:eastAsia="zh-CN"/>
+        </w:rPr>
+      </w:pPr>
+      <w:r>
+        <w:rPr>
+          <w:rFonts w:hint="eastAsia"/>
+          <w:lang w:eastAsia="zh-CN"/>
+        </w:rPr>
+        <w:lastRenderedPageBreak/>
+        <w:t xml:space="preserve">Task </w:t>
+      </w:r>
+      <w:r>
+        <w:rPr>
+          <w:rFonts w:hint="eastAsia"/>
+          <w:lang w:eastAsia="zh-CN"/>
+        </w:rPr>
+        <w:t>2</w:t>
+      </w:r>
+    </w:p>
+    <w:p>
+      <w:pPr>
+        <w:rPr>
+          <w:lang w:eastAsia="zh-CN"/>
+        </w:rPr>
+      </w:pPr>
+      <w:r>
+        <w:rPr>
+          <w:rFonts w:hint="eastAsia"/>
+          <w:lang w:eastAsia="zh-CN"/>
+        </w:rPr>
+        <w:t>P</w:t>
+      </w:r>
+      <w:r>
+        <w:rPr>
+          <w:lang w:eastAsia="zh-CN"/>
+        </w:rPr>
+        <w:t>hotograph of the implementation</w:t>
+      </w:r>
+      <w:r>
+        <w:rPr>
+          <w:rFonts w:hint="eastAsia"/>
+          <w:lang w:eastAsia="zh-CN"/>
+        </w:rPr>
+        <w:t>:</w:t>
+      </w:r>
+    </w:p>
+    <w:p>
+      <w:pPr>
+        <w:rPr>
+          <w:highlight w:val="cyan"/>
+          <w:lang w:eastAsia="zh-CN"/>
+        </w:rPr>
+      </w:pPr>
+      <w:r>
+        <w:rPr>
+          <w:noProof/>
+          <w:highlight w:val="cyan"/>
+          <w:lang w:eastAsia="zh-CN"/>
+        </w:rPr>
+        <w:drawing>
+          <wp:inline distT="0" distB="0" distL="0" distR="0" wp14:anchorId="06F37FCB" wp14:editId="74184562">
+            <wp:extent cx="5727700" cy="3800421"/>
+            <wp:effectExtent l="0" t="0" r="6350" b="0"/>
+            <wp:docPr id="1407827307" name="Picture 3"/>
+            <wp:cNvGraphicFramePr>
+              <a:graphicFrameLocks xmlns:a="http://schemas.openxmlformats.org/drawingml/2006/main" noChangeAspect="1"/>
+            </wp:cNvGraphicFramePr>
+            <a:graphic xmlns:a="http://schemas.openxmlformats.org/drawingml/2006/main">
+              <a:graphicData uri="http://schemas.openxmlformats.org/drawingml/2006/picture">
+                <pic:pic xmlns:pic="http://schemas.openxmlformats.org/drawingml/2006/picture">
+                  <pic:nvPicPr>
+                    <pic:cNvPr id="0" name="Picture 1"/>
+                    <pic:cNvPicPr>
+                      <a:picLocks noChangeAspect="1" noChangeArrowheads="1"/>
+                    </pic:cNvPicPr>
+                  </pic:nvPicPr>
+                  <pic:blipFill rotWithShape="1">
+                    <a:blip r:embed="rId10" cstate="print">
+                      <a:extLst>
+                        <a:ext uri="{28A0092B-C50C-407E-A947-70E740481C1C}">
+                          <a14:useLocalDpi xmlns:a14="http://schemas.microsoft.com/office/drawing/2010/main" val="0"/>
+                        </a:ext>
+                      </a:extLst>
+                    </a:blip>
+                    <a:srcRect l="18979" t="29882" r="22308" b="18195"/>
+                    <a:stretch>
+                      <a:fillRect/>
+                    </a:stretch>
+                  </pic:blipFill>
+                  <pic:spPr bwMode="auto">
+                    <a:xfrm>
+                      <a:off x="0" y="0"/>
+                      <a:ext cx="5735018" cy="3805277"/>
+                    </a:xfrm>
+                    <a:prstGeom prst="rect">
+                      <a:avLst/>
+                    </a:prstGeom>
+                    <a:noFill/>
+                    <a:ln>
+                      <a:noFill/>
+                    </a:ln>
+                    <a:extLst>
+                      <a:ext uri="{53640926-AAD7-44D8-BBD7-CCE9431645EC}">
+                        <a14:shadowObscured xmlns:a14="http://schemas.microsoft.com/office/drawing/2010/main"/>
+                      </a:ext>
+                    </a:extLst>
+                  </pic:spPr>
+                </pic:pic>
+              </a:graphicData>
+            </a:graphic>
+          </wp:inline>
+        </w:drawing>
+      </w:r>
+    </w:p>
+    <w:p>
+      <w:pPr>
+        <w:spacing w:line="259" w:lineRule="auto"/>
+        <w:rPr>
+          <w:lang w:eastAsia="zh-CN"/>
+        </w:rPr>
+      </w:pPr>
+      <w:r>
+        <w:rPr>
+          <w:lang w:eastAsia="zh-CN"/>
+        </w:rPr>
+        <w:br w:type="page"/>
+      </w:r>
+    </w:p>
+    <w:p>
+      <w:pPr>
+        <w:rPr>
+          <w:lang w:eastAsia="zh-CN"/>
+        </w:rPr>
+      </w:pPr>
+      <w:r>
+        <w:rPr>
+          <w:rFonts w:hint="eastAsia"/>
+          <w:lang w:eastAsia="zh-CN"/>
+        </w:rPr>
+        <w:lastRenderedPageBreak/>
+        <w:t>Flow Chart of Function</w:t>
+      </w:r>
+      <w:r>
+        <w:rPr>
+          <w:rFonts w:hint="eastAsia"/>
+          <w:lang w:eastAsia="zh-CN"/>
+        </w:rPr>
+        <w:t>:</w:t>
+      </w:r>
+    </w:p>
+    <w:p>
+      <w:pPr>
+        <w:rPr>
+          <w:highlight w:val="cyan"/>
+          <w:lang w:eastAsia="zh-CN"/>
+        </w:rPr>
+      </w:pPr>
+      <w:r>
+        <w:rPr>
+          <w:rFonts w:hint="eastAsia"/>
+          <w:noProof/>
+          <w:highlight w:val="cyan"/>
+          <w:lang w:eastAsia="zh-CN"/>
+        </w:rPr>
+        <w:drawing>
+          <wp:inline distT="0" distB="0" distL="0" distR="0" wp14:anchorId="31EB9130" wp14:editId="503DF37A">
+            <wp:extent cx="5054600" cy="8454637"/>
+            <wp:effectExtent l="0" t="0" r="0" b="3810"/>
+            <wp:docPr id="295920347" name="Picture 5"/>
+            <wp:cNvGraphicFramePr>
+              <a:graphicFrameLocks xmlns:a="http://schemas.openxmlformats.org/drawingml/2006/main" noChangeAspect="1"/>
+            </wp:cNvGraphicFramePr>
+            <a:graphic xmlns:a="http://schemas.openxmlformats.org/drawingml/2006/main">
+              <a:graphicData uri="http://schemas.openxmlformats.org/drawingml/2006/picture">
+                <pic:pic xmlns:pic="http://schemas.openxmlformats.org/drawingml/2006/picture">
+                  <pic:nvPicPr>
+                    <pic:cNvPr id="0" name="Picture 3"/>
+                    <pic:cNvPicPr>
+                      <a:picLocks noChangeAspect="1" noChangeArrowheads="1"/>
+                    </pic:cNvPicPr>
+                  </pic:nvPicPr>
+                  <pic:blipFill>
+                    <a:blip r:embed="rId11" cstate="print">
+                      <a:extLst>
+                        <a:ext uri="{28A0092B-C50C-407E-A947-70E740481C1C}">
+                          <a14:useLocalDpi xmlns:a14="http://schemas.microsoft.com/office/drawing/2010/main" val="0"/>
+                        </a:ext>
+                      </a:extLst>
+                    </a:blip>
+                    <a:srcRect/>
+                    <a:stretch>
+                      <a:fillRect/>
+                    </a:stretch>
+                  </pic:blipFill>
+                  <pic:spPr bwMode="auto">
+                    <a:xfrm>
+                      <a:off x="0" y="0"/>
+                      <a:ext cx="5062553" cy="8467940"/>
+                    </a:xfrm>
+                    <a:prstGeom prst="rect">
+                      <a:avLst/>
+                    </a:prstGeom>
+                    <a:noFill/>
+                    <a:ln>
+                      <a:noFill/>
+                    </a:ln>
+                  </pic:spPr>
+                </pic:pic>
+              </a:graphicData>
+            </a:graphic>
+          </wp:inline>
+        </w:drawing>
+      </w:r>
+    </w:p>
     <w:sectPr>
-      <w:headerReference w:type="even" r:id="rId10"/>
-      <w:headerReference w:type="default" r:id="rId11"/>
-      <w:footerReference w:type="even" r:id="rId12"/>
-      <w:footerReference w:type="default" r:id="rId13"/>
-      <w:headerReference w:type="first" r:id="rId14"/>
-      <w:footerReference w:type="first" r:id="rId15"/>
+      <w:headerReference w:type="even" r:id="rId12"/>
+      <w:headerReference w:type="default" r:id="rId13"/>
+      <w:footerReference w:type="even" r:id="rId14"/>
+      <w:footerReference w:type="default" r:id="rId15"/>
+      <w:headerReference w:type="first" r:id="rId16"/>
+      <w:footerReference w:type="first" r:id="rId17"/>
       <w:pgSz w:w="11906" w:h="16838"/>
       <w:pgMar w:top="1440" w:right="1440" w:bottom="1440" w:left="1440" w:header="850" w:footer="708" w:gutter="0"/>
       <w:cols w:space="708"/>
@@ -1615,7 +1844,7 @@
   <w:style w:type="paragraph" w:default="1" w:styleId="Normal">
     <w:name w:val="Normal"/>
     <w:qFormat/>
-    <w:rsid w:val="005072DF"/>
+    <w:rsid w:val="00AC0A36"/>
     <w:pPr>
       <w:spacing w:line="312" w:lineRule="auto"/>
     </w:pPr>
@@ -1671,6 +1900,7 @@
   <w:style w:type="character" w:default="1" w:styleId="DefaultParagraphFont">
     <w:name w:val="Default Paragraph Font"/>
     <w:uiPriority w:val="1"/>
+    <w:semiHidden/>
     <w:unhideWhenUsed/>
   </w:style>
   <w:style w:type="table" w:default="1" w:styleId="TableNormal">

</xml_diff>

<commit_message>
Add a temperature icon display to temp_monitor and complete the temperature recording test. Add comments to temp_monitor to facilitate viewing function functionality using the doc command.
</commit_message>
<xml_diff>
--- a/Sige_Wu_20719618.docx
+++ b/Sige_Wu_20719618.docx
@@ -286,7 +286,7 @@
           <w:lang w:eastAsia="zh-CN"/>
         </w:rPr>
         <w:drawing>
-          <wp:inline distT="0" distB="0" distL="0" distR="0" wp14:anchorId="4D0098F4" wp14:editId="30A7022B">
+          <wp:inline distT="0" distB="0" distL="0" distR="0" wp14:anchorId="4D0098F4" wp14:editId="490809F0">
             <wp:extent cx="5727700" cy="3454400"/>
             <wp:effectExtent l="0" t="0" r="6350" b="0"/>
             <wp:docPr id="2005729460" name="Picture 4"/>
@@ -518,9 +518,9 @@
           <w:lang w:eastAsia="zh-CN"/>
         </w:rPr>
         <w:drawing>
-          <wp:inline distT="0" distB="0" distL="0" distR="0" wp14:anchorId="31EB9130" wp14:editId="503DF37A">
-            <wp:extent cx="5054600" cy="8454637"/>
-            <wp:effectExtent l="0" t="0" r="0" b="3810"/>
+          <wp:inline distT="0" distB="0" distL="0" distR="0" wp14:anchorId="31EB9130" wp14:editId="6EDDAB78">
+            <wp:extent cx="4902200" cy="8135674"/>
+            <wp:effectExtent l="0" t="0" r="0" b="0"/>
             <wp:docPr id="295920347" name="Picture 5"/>
             <wp:cNvGraphicFramePr>
               <a:graphicFrameLocks xmlns:a="http://schemas.openxmlformats.org/drawingml/2006/main" noChangeAspect="1"/>
@@ -550,7 +550,7 @@
                   <pic:spPr bwMode="auto">
                     <a:xfrm>
                       <a:off x="0" y="0"/>
-                      <a:ext cx="5062553" cy="8467940"/>
+                      <a:ext cx="4918496" cy="8162718"/>
                     </a:xfrm>
                     <a:prstGeom prst="rect">
                       <a:avLst/>
@@ -567,13 +567,199 @@
         </w:drawing>
       </w:r>
     </w:p>
+    <w:p>
+      <w:pPr>
+        <w:spacing w:line="259" w:lineRule="auto"/>
+        <w:rPr>
+          <w:highlight w:val="cyan"/>
+          <w:lang w:eastAsia="zh-CN"/>
+        </w:rPr>
+      </w:pPr>
+      <w:r>
+        <w:rPr>
+          <w:highlight w:val="cyan"/>
+          <w:lang w:eastAsia="zh-CN"/>
+        </w:rPr>
+        <w:br w:type="page"/>
+      </w:r>
+    </w:p>
+    <w:p>
+      <w:pPr>
+        <w:rPr>
+          <w:lang w:val="en-US" w:eastAsia="zh-CN"/>
+        </w:rPr>
+      </w:pPr>
+      <w:r>
+        <w:rPr>
+          <w:lang w:val="en-US" w:eastAsia="zh-CN"/>
+        </w:rPr>
+        <w:lastRenderedPageBreak/>
+        <w:t>Snapshot of the plot</w:t>
+      </w:r>
+      <w:r>
+        <w:rPr>
+          <w:lang w:val="en-US" w:eastAsia="zh-CN"/>
+        </w:rPr>
+        <w:t>:</w:t>
+      </w:r>
+      <w:r>
+        <w:rPr>
+          <w:noProof/>
+          <w:lang w:val="en-US" w:eastAsia="zh-CN"/>
+        </w:rPr>
+        <w:drawing>
+          <wp:inline distT="0" distB="0" distL="0" distR="0" wp14:anchorId="0C9D7161" wp14:editId="52324DC0">
+            <wp:extent cx="5645150" cy="4120960"/>
+            <wp:effectExtent l="0" t="0" r="0" b="0"/>
+            <wp:docPr id="284345599" name="Picture 3"/>
+            <wp:cNvGraphicFramePr>
+              <a:graphicFrameLocks xmlns:a="http://schemas.openxmlformats.org/drawingml/2006/main" noChangeAspect="1"/>
+            </wp:cNvGraphicFramePr>
+            <a:graphic xmlns:a="http://schemas.openxmlformats.org/drawingml/2006/main">
+              <a:graphicData uri="http://schemas.openxmlformats.org/drawingml/2006/picture">
+                <pic:pic xmlns:pic="http://schemas.openxmlformats.org/drawingml/2006/picture">
+                  <pic:nvPicPr>
+                    <pic:cNvPr id="0" name="Picture 1"/>
+                    <pic:cNvPicPr>
+                      <a:picLocks noChangeAspect="1" noChangeArrowheads="1"/>
+                    </pic:cNvPicPr>
+                  </pic:nvPicPr>
+                  <pic:blipFill>
+                    <a:blip r:embed="rId12" cstate="print">
+                      <a:extLst>
+                        <a:ext uri="{28A0092B-C50C-407E-A947-70E740481C1C}">
+                          <a14:useLocalDpi xmlns:a14="http://schemas.microsoft.com/office/drawing/2010/main" val="0"/>
+                        </a:ext>
+                      </a:extLst>
+                    </a:blip>
+                    <a:srcRect/>
+                    <a:stretch>
+                      <a:fillRect/>
+                    </a:stretch>
+                  </pic:blipFill>
+                  <pic:spPr bwMode="auto">
+                    <a:xfrm>
+                      <a:off x="0" y="0"/>
+                      <a:ext cx="5646542" cy="4121976"/>
+                    </a:xfrm>
+                    <a:prstGeom prst="rect">
+                      <a:avLst/>
+                    </a:prstGeom>
+                    <a:noFill/>
+                    <a:ln>
+                      <a:noFill/>
+                    </a:ln>
+                  </pic:spPr>
+                </pic:pic>
+              </a:graphicData>
+            </a:graphic>
+          </wp:inline>
+        </w:drawing>
+      </w:r>
+      <w:r>
+        <w:rPr>
+          <w:noProof/>
+          <w:lang w:val="en-US" w:eastAsia="zh-CN"/>
+        </w:rPr>
+        <w:drawing>
+          <wp:inline distT="0" distB="0" distL="0" distR="0" wp14:anchorId="0691DF48" wp14:editId="79ABE30C">
+            <wp:extent cx="5619750" cy="4102418"/>
+            <wp:effectExtent l="0" t="0" r="0" b="0"/>
+            <wp:docPr id="844970660" name="Picture 4"/>
+            <wp:cNvGraphicFramePr>
+              <a:graphicFrameLocks xmlns:a="http://schemas.openxmlformats.org/drawingml/2006/main" noChangeAspect="1"/>
+            </wp:cNvGraphicFramePr>
+            <a:graphic xmlns:a="http://schemas.openxmlformats.org/drawingml/2006/main">
+              <a:graphicData uri="http://schemas.openxmlformats.org/drawingml/2006/picture">
+                <pic:pic xmlns:pic="http://schemas.openxmlformats.org/drawingml/2006/picture">
+                  <pic:nvPicPr>
+                    <pic:cNvPr id="0" name="Picture 2"/>
+                    <pic:cNvPicPr>
+                      <a:picLocks noChangeAspect="1" noChangeArrowheads="1"/>
+                    </pic:cNvPicPr>
+                  </pic:nvPicPr>
+                  <pic:blipFill>
+                    <a:blip r:embed="rId13" cstate="print">
+                      <a:extLst>
+                        <a:ext uri="{28A0092B-C50C-407E-A947-70E740481C1C}">
+                          <a14:useLocalDpi xmlns:a14="http://schemas.microsoft.com/office/drawing/2010/main" val="0"/>
+                        </a:ext>
+                      </a:extLst>
+                    </a:blip>
+                    <a:srcRect/>
+                    <a:stretch>
+                      <a:fillRect/>
+                    </a:stretch>
+                  </pic:blipFill>
+                  <pic:spPr bwMode="auto">
+                    <a:xfrm>
+                      <a:off x="0" y="0"/>
+                      <a:ext cx="5623302" cy="4105011"/>
+                    </a:xfrm>
+                    <a:prstGeom prst="rect">
+                      <a:avLst/>
+                    </a:prstGeom>
+                    <a:noFill/>
+                    <a:ln>
+                      <a:noFill/>
+                    </a:ln>
+                  </pic:spPr>
+                </pic:pic>
+              </a:graphicData>
+            </a:graphic>
+          </wp:inline>
+        </w:drawing>
+      </w:r>
+    </w:p>
+    <w:p>
+      <w:pPr>
+        <w:spacing w:line="259" w:lineRule="auto"/>
+        <w:rPr>
+          <w:lang w:val="en-US" w:eastAsia="zh-CN"/>
+        </w:rPr>
+      </w:pPr>
+      <w:r>
+        <w:rPr>
+          <w:lang w:val="en-US" w:eastAsia="zh-CN"/>
+        </w:rPr>
+        <w:br w:type="page"/>
+      </w:r>
+    </w:p>
+    <w:p>
+      <w:pPr>
+        <w:rPr>
+          <w:lang w:eastAsia="zh-CN"/>
+        </w:rPr>
+      </w:pPr>
+      <w:r>
+        <w:rPr>
+          <w:lang w:eastAsia="zh-CN"/>
+        </w:rPr>
+        <w:lastRenderedPageBreak/>
+        <w:t xml:space="preserve">Final </w:t>
+      </w:r>
+      <w:r>
+        <w:rPr>
+          <w:rFonts w:hint="eastAsia"/>
+          <w:lang w:eastAsia="zh-CN"/>
+        </w:rPr>
+        <w:t>Flow Chart of Function:</w:t>
+      </w:r>
+    </w:p>
+    <w:p>
+      <w:pPr>
+        <w:rPr>
+          <w:lang w:eastAsia="zh-CN"/>
+        </w:rPr>
+      </w:pPr>
+    </w:p>
     <w:sectPr>
-      <w:headerReference w:type="even" r:id="rId12"/>
-      <w:headerReference w:type="default" r:id="rId13"/>
-      <w:footerReference w:type="even" r:id="rId14"/>
-      <w:footerReference w:type="default" r:id="rId15"/>
-      <w:headerReference w:type="first" r:id="rId16"/>
-      <w:footerReference w:type="first" r:id="rId17"/>
+      <w:headerReference w:type="even" r:id="rId14"/>
+      <w:headerReference w:type="default" r:id="rId15"/>
+      <w:footerReference w:type="even" r:id="rId16"/>
+      <w:footerReference w:type="default" r:id="rId17"/>
+      <w:headerReference w:type="first" r:id="rId18"/>
+      <w:footerReference w:type="first" r:id="rId19"/>
       <w:pgSz w:w="11906" w:h="16838"/>
       <w:pgMar w:top="1440" w:right="1440" w:bottom="1440" w:left="1440" w:header="850" w:footer="708" w:gutter="0"/>
       <w:cols w:space="708"/>
@@ -1844,7 +2030,7 @@
   <w:style w:type="paragraph" w:default="1" w:styleId="Normal">
     <w:name w:val="Normal"/>
     <w:qFormat/>
-    <w:rsid w:val="00AC0A36"/>
+    <w:rsid w:val="00F603CD"/>
     <w:pPr>
       <w:spacing w:line="312" w:lineRule="auto"/>
     </w:pPr>
@@ -1900,7 +2086,6 @@
   <w:style w:type="character" w:default="1" w:styleId="DefaultParagraphFont">
     <w:name w:val="Default Paragraph Font"/>
     <w:uiPriority w:val="1"/>
-    <w:semiHidden/>
     <w:unhideWhenUsed/>
   </w:style>
   <w:style w:type="table" w:default="1" w:styleId="TableNormal">

</xml_diff>

<commit_message>
Update the flow chart of function temp_monitor.
</commit_message>
<xml_diff>
--- a/Sige_Wu_20719618.docx
+++ b/Sige_Wu_20719618.docx
@@ -286,7 +286,7 @@
           <w:lang w:eastAsia="zh-CN"/>
         </w:rPr>
         <w:drawing>
-          <wp:inline distT="0" distB="0" distL="0" distR="0" wp14:anchorId="4D0098F4" wp14:editId="490809F0">
+          <wp:inline distT="0" distB="0" distL="0" distR="0" wp14:anchorId="4D0098F4" wp14:editId="06C52FDF">
             <wp:extent cx="5727700" cy="3454400"/>
             <wp:effectExtent l="0" t="0" r="6350" b="0"/>
             <wp:docPr id="2005729460" name="Picture 4"/>
@@ -518,7 +518,7 @@
           <w:lang w:eastAsia="zh-CN"/>
         </w:rPr>
         <w:drawing>
-          <wp:inline distT="0" distB="0" distL="0" distR="0" wp14:anchorId="31EB9130" wp14:editId="6EDDAB78">
+          <wp:inline distT="0" distB="0" distL="0" distR="0" wp14:anchorId="31EB9130" wp14:editId="25F36DBA">
             <wp:extent cx="4902200" cy="8135674"/>
             <wp:effectExtent l="0" t="0" r="0" b="0"/>
             <wp:docPr id="295920347" name="Picture 5"/>
@@ -752,14 +752,90 @@
           <w:lang w:eastAsia="zh-CN"/>
         </w:rPr>
       </w:pPr>
+      <w:r>
+        <w:rPr>
+          <w:noProof/>
+          <w:lang w:eastAsia="zh-CN"/>
+        </w:rPr>
+        <w:drawing>
+          <wp:inline distT="0" distB="0" distL="0" distR="0" wp14:anchorId="2170958B" wp14:editId="362E36A7">
+            <wp:extent cx="4273550" cy="7990677"/>
+            <wp:effectExtent l="0" t="0" r="0" b="0"/>
+            <wp:docPr id="1937340141" name="Picture 3"/>
+            <wp:cNvGraphicFramePr>
+              <a:graphicFrameLocks xmlns:a="http://schemas.openxmlformats.org/drawingml/2006/main" noChangeAspect="1"/>
+            </wp:cNvGraphicFramePr>
+            <a:graphic xmlns:a="http://schemas.openxmlformats.org/drawingml/2006/main">
+              <a:graphicData uri="http://schemas.openxmlformats.org/drawingml/2006/picture">
+                <pic:pic xmlns:pic="http://schemas.openxmlformats.org/drawingml/2006/picture">
+                  <pic:nvPicPr>
+                    <pic:cNvPr id="0" name="Picture 1"/>
+                    <pic:cNvPicPr>
+                      <a:picLocks noChangeAspect="1" noChangeArrowheads="1"/>
+                    </pic:cNvPicPr>
+                  </pic:nvPicPr>
+                  <pic:blipFill>
+                    <a:blip r:embed="rId14" cstate="print">
+                      <a:extLst>
+                        <a:ext uri="{28A0092B-C50C-407E-A947-70E740481C1C}">
+                          <a14:useLocalDpi xmlns:a14="http://schemas.microsoft.com/office/drawing/2010/main" val="0"/>
+                        </a:ext>
+                      </a:extLst>
+                    </a:blip>
+                    <a:srcRect/>
+                    <a:stretch>
+                      <a:fillRect/>
+                    </a:stretch>
+                  </pic:blipFill>
+                  <pic:spPr bwMode="auto">
+                    <a:xfrm>
+                      <a:off x="0" y="0"/>
+                      <a:ext cx="4280167" cy="8003050"/>
+                    </a:xfrm>
+                    <a:prstGeom prst="rect">
+                      <a:avLst/>
+                    </a:prstGeom>
+                    <a:noFill/>
+                    <a:ln>
+                      <a:noFill/>
+                    </a:ln>
+                  </pic:spPr>
+                </pic:pic>
+              </a:graphicData>
+            </a:graphic>
+          </wp:inline>
+        </w:drawing>
+      </w:r>
+    </w:p>
+    <w:p>
+      <w:pPr>
+        <w:spacing w:line="259" w:lineRule="auto"/>
+        <w:rPr>
+          <w:lang w:eastAsia="zh-CN"/>
+        </w:rPr>
+      </w:pPr>
+      <w:r>
+        <w:rPr>
+          <w:lang w:eastAsia="zh-CN"/>
+        </w:rPr>
+        <w:br w:type="page"/>
+      </w:r>
+    </w:p>
+    <w:p>
+      <w:pPr>
+        <w:rPr>
+          <w:rFonts w:hint="eastAsia"/>
+          <w:lang w:eastAsia="zh-CN"/>
+        </w:rPr>
+      </w:pPr>
     </w:p>
     <w:sectPr>
-      <w:headerReference w:type="even" r:id="rId14"/>
-      <w:headerReference w:type="default" r:id="rId15"/>
-      <w:footerReference w:type="even" r:id="rId16"/>
-      <w:footerReference w:type="default" r:id="rId17"/>
-      <w:headerReference w:type="first" r:id="rId18"/>
-      <w:footerReference w:type="first" r:id="rId19"/>
+      <w:headerReference w:type="even" r:id="rId15"/>
+      <w:headerReference w:type="default" r:id="rId16"/>
+      <w:footerReference w:type="even" r:id="rId17"/>
+      <w:footerReference w:type="default" r:id="rId18"/>
+      <w:headerReference w:type="first" r:id="rId19"/>
+      <w:footerReference w:type="first" r:id="rId20"/>
       <w:pgSz w:w="11906" w:h="16838"/>
       <w:pgMar w:top="1440" w:right="1440" w:bottom="1440" w:left="1440" w:header="850" w:footer="708" w:gutter="0"/>
       <w:cols w:space="708"/>
@@ -2086,6 +2162,7 @@
   <w:style w:type="character" w:default="1" w:styleId="DefaultParagraphFont">
     <w:name w:val="Default Paragraph Font"/>
     <w:uiPriority w:val="1"/>
+    <w:semiHidden/>
     <w:unhideWhenUsed/>
   </w:style>
   <w:style w:type="table" w:default="1" w:styleId="TableNormal">

</xml_diff>

<commit_message>
Complete the flowchart for Task 3.
</commit_message>
<xml_diff>
--- a/Sige_Wu_20719618.docx
+++ b/Sige_Wu_20719618.docx
@@ -286,7 +286,7 @@
           <w:lang w:eastAsia="zh-CN"/>
         </w:rPr>
         <w:drawing>
-          <wp:inline distT="0" distB="0" distL="0" distR="0" wp14:anchorId="4D0098F4" wp14:editId="06C52FDF">
+          <wp:inline distT="0" distB="0" distL="0" distR="0" wp14:anchorId="4D0098F4" wp14:editId="28A4B1BE">
             <wp:extent cx="5727700" cy="3454400"/>
             <wp:effectExtent l="0" t="0" r="6350" b="0"/>
             <wp:docPr id="2005729460" name="Picture 4"/>
@@ -518,7 +518,7 @@
           <w:lang w:eastAsia="zh-CN"/>
         </w:rPr>
         <w:drawing>
-          <wp:inline distT="0" distB="0" distL="0" distR="0" wp14:anchorId="31EB9130" wp14:editId="25F36DBA">
+          <wp:inline distT="0" distB="0" distL="0" distR="0" wp14:anchorId="31EB9130" wp14:editId="43121B0E">
             <wp:extent cx="4902200" cy="8135674"/>
             <wp:effectExtent l="0" t="0" r="0" b="0"/>
             <wp:docPr id="295920347" name="Picture 5"/>
@@ -823,19 +823,188 @@
     </w:p>
     <w:p>
       <w:pPr>
+        <w:pStyle w:val="Title"/>
+        <w:rPr>
+          <w:lang w:eastAsia="zh-CN"/>
+        </w:rPr>
+      </w:pPr>
+      <w:r>
         <w:rPr>
           <w:rFonts w:hint="eastAsia"/>
           <w:lang w:eastAsia="zh-CN"/>
         </w:rPr>
+        <w:lastRenderedPageBreak/>
+        <w:t xml:space="preserve">Task </w:t>
+      </w:r>
+      <w:r>
+        <w:rPr>
+          <w:rFonts w:hint="eastAsia"/>
+          <w:lang w:eastAsia="zh-CN"/>
+        </w:rPr>
+        <w:t>3</w:t>
+      </w:r>
+    </w:p>
+    <w:p>
+      <w:pPr>
+        <w:rPr>
+          <w:lang w:eastAsia="zh-CN"/>
+        </w:rPr>
+      </w:pPr>
+      <w:r>
+        <w:rPr>
+          <w:rFonts w:hint="eastAsia"/>
+          <w:lang w:eastAsia="zh-CN"/>
+        </w:rPr>
+        <w:t>Flow Chart of Function:</w:t>
+      </w:r>
+    </w:p>
+    <w:p>
+      <w:pPr>
+        <w:rPr>
+          <w:lang w:eastAsia="zh-CN"/>
+        </w:rPr>
+      </w:pPr>
+      <w:r>
+        <w:rPr>
+          <w:noProof/>
+          <w:lang w:eastAsia="zh-CN"/>
+        </w:rPr>
+        <w:drawing>
+          <wp:inline distT="0" distB="0" distL="0" distR="0" wp14:anchorId="2E081FD4" wp14:editId="3E2AAD2F">
+            <wp:extent cx="3663950" cy="7785894"/>
+            <wp:effectExtent l="0" t="0" r="0" b="5715"/>
+            <wp:docPr id="252292641" name="Picture 3"/>
+            <wp:cNvGraphicFramePr>
+              <a:graphicFrameLocks xmlns:a="http://schemas.openxmlformats.org/drawingml/2006/main" noChangeAspect="1"/>
+            </wp:cNvGraphicFramePr>
+            <a:graphic xmlns:a="http://schemas.openxmlformats.org/drawingml/2006/main">
+              <a:graphicData uri="http://schemas.openxmlformats.org/drawingml/2006/picture">
+                <pic:pic xmlns:pic="http://schemas.openxmlformats.org/drawingml/2006/picture">
+                  <pic:nvPicPr>
+                    <pic:cNvPr id="0" name="Picture 1"/>
+                    <pic:cNvPicPr>
+                      <a:picLocks noChangeAspect="1" noChangeArrowheads="1"/>
+                    </pic:cNvPicPr>
+                  </pic:nvPicPr>
+                  <pic:blipFill>
+                    <a:blip r:embed="rId15" cstate="print">
+                      <a:extLst>
+                        <a:ext uri="{28A0092B-C50C-407E-A947-70E740481C1C}">
+                          <a14:useLocalDpi xmlns:a14="http://schemas.microsoft.com/office/drawing/2010/main" val="0"/>
+                        </a:ext>
+                      </a:extLst>
+                    </a:blip>
+                    <a:srcRect/>
+                    <a:stretch>
+                      <a:fillRect/>
+                    </a:stretch>
+                  </pic:blipFill>
+                  <pic:spPr bwMode="auto">
+                    <a:xfrm>
+                      <a:off x="0" y="0"/>
+                      <a:ext cx="3673790" cy="7806804"/>
+                    </a:xfrm>
+                    <a:prstGeom prst="rect">
+                      <a:avLst/>
+                    </a:prstGeom>
+                    <a:noFill/>
+                    <a:ln>
+                      <a:noFill/>
+                    </a:ln>
+                  </pic:spPr>
+                </pic:pic>
+              </a:graphicData>
+            </a:graphic>
+          </wp:inline>
+        </w:drawing>
+      </w:r>
+    </w:p>
+    <w:p>
+      <w:pPr>
+        <w:spacing w:line="259" w:lineRule="auto"/>
+        <w:rPr>
+          <w:lang w:eastAsia="zh-CN"/>
+        </w:rPr>
+      </w:pPr>
+      <w:r>
+        <w:rPr>
+          <w:lang w:eastAsia="zh-CN"/>
+        </w:rPr>
+        <w:br w:type="page"/>
+      </w:r>
+    </w:p>
+    <w:p>
+      <w:pPr>
+        <w:pStyle w:val="Title"/>
+        <w:rPr>
+          <w:lang w:eastAsia="zh-CN"/>
+        </w:rPr>
+      </w:pPr>
+      <w:r>
+        <w:rPr>
+          <w:rFonts w:hint="eastAsia"/>
+          <w:lang w:eastAsia="zh-CN"/>
+        </w:rPr>
+        <w:lastRenderedPageBreak/>
+        <w:t xml:space="preserve">Task </w:t>
+      </w:r>
+      <w:r>
+        <w:rPr>
+          <w:rFonts w:hint="eastAsia"/>
+          <w:lang w:eastAsia="zh-CN"/>
+        </w:rPr>
+        <w:t>4</w:t>
+      </w:r>
+    </w:p>
+    <w:p>
+      <w:pPr>
+        <w:rPr>
+          <w:lang w:eastAsia="zh-CN"/>
+        </w:rPr>
+      </w:pPr>
+      <w:r>
+        <w:rPr>
+          <w:rFonts w:hint="eastAsia"/>
+          <w:lang w:eastAsia="zh-CN"/>
+        </w:rPr>
+        <w:t xml:space="preserve">Reflective </w:t>
+      </w:r>
+      <w:r>
+        <w:rPr>
+          <w:rFonts w:hint="eastAsia"/>
+          <w:lang w:eastAsia="zh-CN"/>
+        </w:rPr>
+        <w:t>S</w:t>
+      </w:r>
+      <w:r>
+        <w:rPr>
+          <w:rFonts w:hint="eastAsia"/>
+          <w:lang w:eastAsia="zh-CN"/>
+        </w:rPr>
+        <w:t>tatement</w:t>
+      </w:r>
+      <w:r>
+        <w:rPr>
+          <w:rFonts w:hint="eastAsia"/>
+          <w:lang w:eastAsia="zh-CN"/>
+        </w:rPr>
+        <w:t>:</w:t>
+      </w:r>
+    </w:p>
+    <w:p>
+      <w:pPr>
+        <w:rPr>
+          <w:lang w:eastAsia="zh-CN"/>
+        </w:rPr>
       </w:pPr>
     </w:p>
     <w:sectPr>
-      <w:headerReference w:type="even" r:id="rId15"/>
-      <w:headerReference w:type="default" r:id="rId16"/>
-      <w:footerReference w:type="even" r:id="rId17"/>
-      <w:footerReference w:type="default" r:id="rId18"/>
-      <w:headerReference w:type="first" r:id="rId19"/>
-      <w:footerReference w:type="first" r:id="rId20"/>
+      <w:headerReference w:type="even" r:id="rId16"/>
+      <w:headerReference w:type="default" r:id="rId17"/>
+      <w:footerReference w:type="even" r:id="rId18"/>
+      <w:footerReference w:type="default" r:id="rId19"/>
+      <w:headerReference w:type="first" r:id="rId20"/>
+      <w:footerReference w:type="first" r:id="rId21"/>
       <w:pgSz w:w="11906" w:h="16838"/>
       <w:pgMar w:top="1440" w:right="1440" w:bottom="1440" w:left="1440" w:header="850" w:footer="708" w:gutter="0"/>
       <w:cols w:space="708"/>
@@ -2106,7 +2275,7 @@
   <w:style w:type="paragraph" w:default="1" w:styleId="Normal">
     <w:name w:val="Normal"/>
     <w:qFormat/>
-    <w:rsid w:val="00F603CD"/>
+    <w:rsid w:val="00E47B58"/>
     <w:pPr>
       <w:spacing w:line="312" w:lineRule="auto"/>
     </w:pPr>
@@ -2162,7 +2331,6 @@
   <w:style w:type="character" w:default="1" w:styleId="DefaultParagraphFont">
     <w:name w:val="Default Paragraph Font"/>
     <w:uiPriority w:val="1"/>
-    <w:semiHidden/>
     <w:unhideWhenUsed/>
   </w:style>
   <w:style w:type="table" w:default="1" w:styleId="TableNormal">

</xml_diff>

<commit_message>
Modify the reflective statement and add a commit date to the document.
</commit_message>
<xml_diff>
--- a/Sige_Wu_20719618.docx
+++ b/Sige_Wu_20719618.docx
@@ -68,8 +68,10 @@
     <w:p>
       <w:pPr>
         <w:rPr>
+          <w:rFonts w:hint="eastAsia"/>
           <w:b/>
           <w:bCs/>
+          <w:lang w:eastAsia="zh-CN"/>
         </w:rPr>
       </w:pPr>
       <w:r>
@@ -81,10 +83,12 @@
       </w:r>
       <w:r>
         <w:rPr>
+          <w:rFonts w:hint="eastAsia"/>
           <w:b/>
           <w:bCs/>
-        </w:rPr>
-        <w:t>Add submission date here</w:t>
+          <w:lang w:eastAsia="zh-CN"/>
+        </w:rPr>
+        <w:t>2026/4/25</w:t>
       </w:r>
     </w:p>
     <w:p/>
@@ -286,7 +290,7 @@
           <w:lang w:eastAsia="zh-CN"/>
         </w:rPr>
         <w:drawing>
-          <wp:inline distT="0" distB="0" distL="0" distR="0" wp14:anchorId="4D0098F4" wp14:editId="45B0D711">
+          <wp:inline distT="0" distB="0" distL="0" distR="0" wp14:anchorId="4D0098F4" wp14:editId="3EAD2BBF">
             <wp:extent cx="5727700" cy="3454400"/>
             <wp:effectExtent l="0" t="0" r="6350" b="0"/>
             <wp:docPr id="2005729460" name="Picture 4"/>
@@ -518,7 +522,7 @@
           <w:lang w:eastAsia="zh-CN"/>
         </w:rPr>
         <w:drawing>
-          <wp:inline distT="0" distB="0" distL="0" distR="0" wp14:anchorId="31EB9130" wp14:editId="3E57B468">
+          <wp:inline distT="0" distB="0" distL="0" distR="0" wp14:anchorId="31EB9130" wp14:editId="733B22A6">
             <wp:extent cx="4902200" cy="8135674"/>
             <wp:effectExtent l="0" t="0" r="0" b="0"/>
             <wp:docPr id="295920347" name="Picture 5"/>
@@ -987,6 +991,7 @@
     <w:p>
       <w:pPr>
         <w:rPr>
+          <w:rFonts w:hint="eastAsia"/>
           <w:lang w:eastAsia="zh-CN"/>
         </w:rPr>
       </w:pPr>
@@ -996,11 +1001,36 @@
         </w:rPr>
         <w:t>In this project, I implemented temperature monitoring, LED status display, and temperature change rate prediction functions based on Arduino and MATLAB.</w:t>
       </w:r>
-    </w:p>
-    <w:p>
-      <w:pPr>
-        <w:rPr>
-          <w:rFonts w:hint="eastAsia"/>
+      <w:r>
+        <w:rPr>
+          <w:rFonts w:hint="eastAsia"/>
+          <w:lang w:eastAsia="zh-CN"/>
+        </w:rPr>
+        <w:t xml:space="preserve"> </w:t>
+      </w:r>
+      <w:r>
+        <w:rPr>
+          <w:lang w:eastAsia="zh-CN"/>
+        </w:rPr>
+        <w:t>I use</w:t>
+      </w:r>
+      <w:r>
+        <w:rPr>
+          <w:rFonts w:hint="eastAsia"/>
+          <w:lang w:eastAsia="zh-CN"/>
+        </w:rPr>
+        <w:t>d</w:t>
+      </w:r>
+      <w:r>
+        <w:rPr>
+          <w:lang w:eastAsia="zh-CN"/>
+        </w:rPr>
+        <w:t xml:space="preserve"> Git to manage my project, and every modification is documented with a standardized commit message. It also links to a remote private repository, and I can provide access if needed.</w:t>
+      </w:r>
+    </w:p>
+    <w:p>
+      <w:pPr>
+        <w:rPr>
           <w:lang w:eastAsia="zh-CN"/>
         </w:rPr>
       </w:pPr>
@@ -1027,7 +1057,6 @@
     <w:p>
       <w:pPr>
         <w:rPr>
-          <w:rFonts w:hint="eastAsia"/>
           <w:lang w:eastAsia="zh-CN"/>
         </w:rPr>
       </w:pPr>
@@ -1080,7 +1109,6 @@
     <w:p>
       <w:pPr>
         <w:rPr>
-          <w:rFonts w:hint="eastAsia"/>
           <w:lang w:eastAsia="zh-CN"/>
         </w:rPr>
       </w:pPr>

</xml_diff>